<commit_message>
Add image instructions to the blog template and how-to guide
</commit_message>
<xml_diff>
--- a/templates/Blog post template.docx
+++ b/templates/Blog post template.docx
@@ -268,6 +268,19 @@
     </w:p>
     <w:p>
       <w:pPr>
+        <w:spacing w:after="140"/>
+      </w:pPr>
+      <w:r>
+        <w:rPr>
+          <w:i/>
+          <w:iCs/>
+          <w:color w:val="5A5A5A"/>
+        </w:rPr>
+        <w:t xml:space="preserve">To add an image, insert it into this document where you want it to appear. For a caption, type a short line of italic text directly below the image. Claude resizes large images automatically, so insert whatever you have.</w:t>
+      </w:r>
+    </w:p>
+    <w:p>
+      <w:pPr>
         <w:spacing w:after="600" w:before="80"/>
       </w:pPr>
       <w:r>
@@ -466,6 +479,42 @@
     </w:lvl>
   </w:abstractNum>
   <w:abstractNum w:abstractNumId="3" w15:restartNumberingAfterBreak="0">
+    <w:multiLevelType w:val="hybridMultilevel"/>
+    <w:lvl w:ilvl="0" w15:tentative="1">
+      <w:start w:val="1"/>
+      <w:numFmt w:val="decimal"/>
+      <w:lvlText w:val="%1."/>
+      <w:lvlJc w:val="left"/>
+      <w:pPr>
+        <w:ind w:left="540" w:hanging="280"/>
+      </w:pPr>
+    </w:lvl>
+  </w:abstractNum>
+  <w:abstractNum w:abstractNumId="4" w15:restartNumberingAfterBreak="0">
+    <w:multiLevelType w:val="hybridMultilevel"/>
+    <w:lvl w:ilvl="0" w15:tentative="1">
+      <w:start w:val="1"/>
+      <w:numFmt w:val="decimal"/>
+      <w:lvlText w:val="%1."/>
+      <w:lvlJc w:val="left"/>
+      <w:pPr>
+        <w:ind w:left="540" w:hanging="280"/>
+      </w:pPr>
+    </w:lvl>
+  </w:abstractNum>
+  <w:abstractNum w:abstractNumId="5" w15:restartNumberingAfterBreak="0">
+    <w:multiLevelType w:val="hybridMultilevel"/>
+    <w:lvl w:ilvl="0" w15:tentative="1">
+      <w:start w:val="1"/>
+      <w:numFmt w:val="decimal"/>
+      <w:lvlText w:val="%1."/>
+      <w:lvlJc w:val="left"/>
+      <w:pPr>
+        <w:ind w:left="540" w:hanging="280"/>
+      </w:pPr>
+    </w:lvl>
+  </w:abstractNum>
+  <w:abstractNum w:abstractNumId="6" w15:restartNumberingAfterBreak="0">
     <w:multiLevelType w:val="hybridMultilevel"/>
     <w:lvl w:ilvl="0" w15:tentative="1">
       <w:start w:val="1"/>
@@ -693,7 +742,7 @@
     <w:next w:val="Normal"/>
     <w:qFormat/>
     <w:pPr>
-      <w:spacing w:after="140" w:before="320"/>
+      <w:spacing w:after="140" w:before="340"/>
       <w:outlineLvl w:val="1"/>
     </w:pPr>
     <w:rPr>

</xml_diff>